<commit_message>
Per-service Client Information section + demo client per service
- OTC Trading samples: Client Name = SuperRich Tech Limited
  (instead of HT Markets MENA FZE), Broker Entity = HT Markets (SVG)
  Ltd. Section 1 A. labels: Client Name / Client ID / Broker Entity /
  Statement Period / Reporting Currency (no Enterprise Name).
- Loans samples: Client Name = SuperRich Tech Limited, Loan Provider
  = Hex Trust Loans Ltd. Same Client-Name/ID/Provider field set.
- Custody samples unchanged: Legal Name / Enterprise Name / Enterprise
  ID / Custodian.
- Mutation of module globals happens at the top of build() per service
  and is restored at the end, so cover page + grey section chrome +
  disclaimer all pick up the right entity.

Co-Authored-By: Claude Opus 4.7 <noreply@anthropic.com>
</commit_message>
<xml_diff>
--- a/mockup/monthly_client_statement/sample-statements/Loans_Detailed_sample.docx
+++ b/mockup/monthly_client_statement/sample-statements/Loans_Detailed_sample.docx
@@ -73,7 +73,7 @@
           <w:color w:val="4A5568"/>
           <w:sz w:val="40"/>
         </w:rPr>
-        <w:t>HT Markets MENA FZE</w:t>
+        <w:t>SuperRich Tech Limited</w:t>
       </w:r>
     </w:p>
     <w:p>
@@ -193,7 +193,7 @@
                 <w:color w:val="0A2342"/>
                 <w:sz w:val="19"/>
               </w:rPr>
-              <w:t>Activity Statement  ·  HT Markets MENA FZE</w:t>
+              <w:t>Activity Statement  ·  SuperRich Tech Limited</w:t>
             </w:r>
           </w:p>
           <w:p>
@@ -268,7 +268,7 @@
                 <w:color w:val="0A2342"/>
                 <w:sz w:val="18"/>
               </w:rPr>
-              <w:t>Legal Name</w:t>
+              <w:t>Client Name</w:t>
             </w:r>
           </w:p>
         </w:tc>
@@ -293,7 +293,7 @@
                 <w:color w:val="4A5568"/>
                 <w:sz w:val="18"/>
               </w:rPr>
-              <w:t>HT Markets MENA FZE</w:t>
+              <w:t>SuperRich Tech Limited</w:t>
             </w:r>
           </w:p>
         </w:tc>
@@ -321,7 +321,7 @@
                 <w:color w:val="0A2342"/>
                 <w:sz w:val="18"/>
               </w:rPr>
-              <w:t>Enterprise Name</w:t>
+              <w:t>Client ID</w:t>
             </w:r>
           </w:p>
         </w:tc>
@@ -347,7 +347,7 @@
                 <w:color w:val="4A5568"/>
                 <w:sz w:val="18"/>
               </w:rPr>
-              <w:t>HT Markets MENA FZE — Custody</w:t>
+              <w:t>3a8c2d14-f1b7-4e95-a623-9d8e7c4b1f5a</w:t>
             </w:r>
           </w:p>
         </w:tc>
@@ -374,7 +374,7 @@
                 <w:color w:val="0A2342"/>
                 <w:sz w:val="18"/>
               </w:rPr>
-              <w:t>Enterprise ID</w:t>
+              <w:t>Loan Provider</w:t>
             </w:r>
           </w:p>
         </w:tc>
@@ -399,7 +399,7 @@
                 <w:color w:val="4A5568"/>
                 <w:sz w:val="18"/>
               </w:rPr>
-              <w:t>21a4bf26-8dcc-11ee-9b69-2346469ca27d</w:t>
+              <w:t>Hex Trust Loans Ltd</w:t>
             </w:r>
           </w:p>
         </w:tc>
@@ -427,7 +427,7 @@
                 <w:color w:val="0A2342"/>
                 <w:sz w:val="18"/>
               </w:rPr>
-              <w:t>Custodian</w:t>
+              <w:t>Statement Period</w:t>
             </w:r>
           </w:p>
         </w:tc>
@@ -435,58 +435,6 @@
           <w:tcPr>
             <w:tcW w:type="dxa" w:w="6746"/>
             <w:shd w:val="clear" w:color="auto" w:fill="F5F7FA"/>
-            <w:tcBorders>
-              <w:bottom w:val="single" w:sz="4" w:color="D0D5DD"/>
-            </w:tcBorders>
-            <w:vAlign w:val="center"/>
-          </w:tcPr>
-          <w:p>
-            <w:pPr>
-              <w:spacing w:before="40" w:after="40"/>
-            </w:pPr>
-            <w:r>
-              <w:rPr>
-                <w:rFonts w:ascii="Arial" w:hAnsi="Arial"/>
-                <w:rFonts w:ascii="Arial" w:hAnsi="Arial" w:cs="Arial"/>
-                <w:b w:val="0"/>
-                <w:i w:val="0"/>
-                <w:color w:val="4A5568"/>
-                <w:sz w:val="18"/>
-              </w:rPr>
-              <w:t>Hex Trust MENA FZE</w:t>
-            </w:r>
-          </w:p>
-        </w:tc>
-      </w:tr>
-      <w:tr>
-        <w:tc>
-          <w:tcPr>
-            <w:tcW w:type="dxa" w:w="3118"/>
-            <w:tcBorders>
-              <w:bottom w:val="single" w:sz="4" w:color="D0D5DD"/>
-            </w:tcBorders>
-            <w:vAlign w:val="center"/>
-          </w:tcPr>
-          <w:p>
-            <w:pPr>
-              <w:spacing w:before="40" w:after="40"/>
-            </w:pPr>
-            <w:r>
-              <w:rPr>
-                <w:rFonts w:ascii="Arial" w:hAnsi="Arial"/>
-                <w:rFonts w:ascii="Arial" w:hAnsi="Arial" w:cs="Arial"/>
-                <w:b/>
-                <w:i w:val="0"/>
-                <w:color w:val="0A2342"/>
-                <w:sz w:val="18"/>
-              </w:rPr>
-              <w:t>Statement Period</w:t>
-            </w:r>
-          </w:p>
-        </w:tc>
-        <w:tc>
-          <w:tcPr>
-            <w:tcW w:type="dxa" w:w="6746"/>
             <w:tcBorders>
               <w:bottom w:val="single" w:sz="4" w:color="D0D5DD"/>
             </w:tcBorders>
@@ -514,7 +462,6 @@
         <w:tc>
           <w:tcPr>
             <w:tcW w:type="dxa" w:w="3118"/>
-            <w:shd w:val="clear" w:color="auto" w:fill="F5F7FA"/>
             <w:tcBorders>
               <w:bottom w:val="single" w:sz="4" w:color="D0D5DD"/>
             </w:tcBorders>
@@ -540,7 +487,6 @@
         <w:tc>
           <w:tcPr>
             <w:tcW w:type="dxa" w:w="6746"/>
-            <w:shd w:val="clear" w:color="auto" w:fill="F5F7FA"/>
             <w:tcBorders>
               <w:bottom w:val="single" w:sz="4" w:color="D0D5DD"/>
             </w:tcBorders>
@@ -1028,7 +974,7 @@
                 <w:color w:val="0A2342"/>
                 <w:sz w:val="19"/>
               </w:rPr>
-              <w:t>Activity Statement  ·  HT Markets MENA FZE</w:t>
+              <w:t>Activity Statement  ·  SuperRich Tech Limited</w:t>
             </w:r>
           </w:p>
           <w:p>
@@ -3996,7 +3942,7 @@
           <w:color w:val="0A2342"/>
           <w:sz w:val="18"/>
         </w:rPr>
-        <w:t>Disclaimer — Hex Trust MENA FZE:</w:t>
+        <w:t>Disclaimer — Hex Trust Loans Ltd:</w:t>
       </w:r>
     </w:p>
     <w:p>
@@ -4012,7 +3958,7 @@
           <w:color w:val="0A2342"/>
           <w:sz w:val="18"/>
         </w:rPr>
-        <w:t>The client must review the information in the monthly statement and give Hex Trust MENA FZE written notice of any suspected error or omission as soon as reasonably possible (in any event, no later than 7 days of accessing / receiving the statement). Hex Trust MENA FZE will not be liable with respect to any error or omission in the monthly statement (including any reliance on any such error or omission) unless the client has timely objected in writing as aforementioned, unless such error or omission is the result of Hex Trust MENA FZE's bad faith or willful default. Hex Trust MENA FZE is regulated by the Virtual Assets Regulatory Authority (VARA), Dubai.</w:t>
+        <w:t>The client must review the information in the monthly statement and give the custodian written notice of any suspected error or omission as soon as reasonably possible (in any event, no later than 7 days of accessing / receiving the statement). The custodian will not be liable with respect to any error or omission in the monthly statement (including any reliance on any such error or omission) unless the client has timely objected in writing as aforementioned, unless such error or omission is the result of the custodian's bad faith or willful default.</w:t>
       </w:r>
     </w:p>
     <w:sectPr>

</xml_diff>

<commit_message>
OTC + Loans Detailed: align typography pass with Custody
- Unify all body-section grey-headers to 'Section 2 — Statement Details'
  across Custody / OTC / Loans (both views). Service is already
  identified on the cover; the section header is now consistent.
- OTC Detailed: add a short descriptive paragraph under A. Trade List
  and B. Settlement Movements to match the Custody pattern.
- Loans Detailed: per-borrowing / per-lending info cards now sit under
  a numbered banner — 'Borrowing position 1 of N — LN-B-2026-0418' —
  using the same _vault_header treatment as Custody vaults. The
  redundant 'Loan ID' kv row inside the card is removed (now in the
  banner).

Co-Authored-By: Claude Opus 4.7 <noreply@anthropic.com>
</commit_message>
<xml_diff>
--- a/mockup/monthly_client_statement/sample-statements/Loans_Detailed_sample.docx
+++ b/mockup/monthly_client_statement/sample-statements/Loans_Detailed_sample.docx
@@ -885,7 +885,7 @@
                 <w:color w:val="0A2342"/>
                 <w:sz w:val="44"/>
               </w:rPr>
-              <w:t>Section 4 — Loans (Detailed View)</w:t>
+              <w:t>Section 2 — Statement Details</w:t>
             </w:r>
           </w:p>
         </w:tc>
@@ -1500,6 +1500,22 @@
         </w:tc>
       </w:tr>
     </w:tbl>
+    <w:p>
+      <w:pPr>
+        <w:spacing w:before="240" w:after="80"/>
+      </w:pPr>
+      <w:r>
+        <w:rPr>
+          <w:rFonts w:ascii="Arial" w:hAnsi="Arial"/>
+          <w:rFonts w:ascii="Arial" w:hAnsi="Arial" w:cs="Arial"/>
+          <w:b/>
+          <w:i w:val="0"/>
+          <w:color w:val="0A2342"/>
+          <w:sz w:val="22"/>
+        </w:rPr>
+        <w:t>Borrowing position 1 of 1 — LN-B-2026-0418</w:t>
+      </w:r>
+    </w:p>
     <w:tbl>
       <w:tblPr>
         <w:tblW w:type="auto" w:w="0"/>
@@ -1532,7 +1548,7 @@
                 <w:color w:val="0A2342"/>
                 <w:sz w:val="18"/>
               </w:rPr>
-              <w:t>Loan ID</w:t>
+              <w:t>Collateral location</w:t>
             </w:r>
           </w:p>
         </w:tc>
@@ -1557,7 +1573,7 @@
                 <w:color w:val="4A5568"/>
                 <w:sz w:val="18"/>
               </w:rPr>
-              <w:t>LN-B-2026-0418</w:t>
+              <w:t>Held in segregated vault under client Enterprise</w:t>
             </w:r>
           </w:p>
         </w:tc>
@@ -1585,7 +1601,7 @@
                 <w:color w:val="0A2342"/>
                 <w:sz w:val="18"/>
               </w:rPr>
-              <w:t>Collateral location</w:t>
+              <w:t>Margin call trigger</w:t>
             </w:r>
           </w:p>
         </w:tc>
@@ -1593,58 +1609,6 @@
           <w:tcPr>
             <w:tcW w:type="dxa" w:w="6746"/>
             <w:shd w:val="clear" w:color="auto" w:fill="F5F7FA"/>
-            <w:tcBorders>
-              <w:bottom w:val="single" w:sz="4" w:color="D0D5DD"/>
-            </w:tcBorders>
-            <w:vAlign w:val="center"/>
-          </w:tcPr>
-          <w:p>
-            <w:pPr>
-              <w:spacing w:before="40" w:after="40"/>
-            </w:pPr>
-            <w:r>
-              <w:rPr>
-                <w:rFonts w:ascii="Arial" w:hAnsi="Arial"/>
-                <w:rFonts w:ascii="Arial" w:hAnsi="Arial" w:cs="Arial"/>
-                <w:b w:val="0"/>
-                <w:i w:val="0"/>
-                <w:color w:val="4A5568"/>
-                <w:sz w:val="18"/>
-              </w:rPr>
-              <w:t>Held in segregated vault under client Enterprise</w:t>
-            </w:r>
-          </w:p>
-        </w:tc>
-      </w:tr>
-      <w:tr>
-        <w:tc>
-          <w:tcPr>
-            <w:tcW w:type="dxa" w:w="3118"/>
-            <w:tcBorders>
-              <w:bottom w:val="single" w:sz="4" w:color="D0D5DD"/>
-            </w:tcBorders>
-            <w:vAlign w:val="center"/>
-          </w:tcPr>
-          <w:p>
-            <w:pPr>
-              <w:spacing w:before="40" w:after="40"/>
-            </w:pPr>
-            <w:r>
-              <w:rPr>
-                <w:rFonts w:ascii="Arial" w:hAnsi="Arial"/>
-                <w:rFonts w:ascii="Arial" w:hAnsi="Arial" w:cs="Arial"/>
-                <w:b/>
-                <w:i w:val="0"/>
-                <w:color w:val="0A2342"/>
-                <w:sz w:val="18"/>
-              </w:rPr>
-              <w:t>Margin call trigger</w:t>
-            </w:r>
-          </w:p>
-        </w:tc>
-        <w:tc>
-          <w:tcPr>
-            <w:tcW w:type="dxa" w:w="6746"/>
             <w:tcBorders>
               <w:bottom w:val="single" w:sz="4" w:color="D0D5DD"/>
             </w:tcBorders>
@@ -1672,7 +1636,6 @@
         <w:tc>
           <w:tcPr>
             <w:tcW w:type="dxa" w:w="3118"/>
-            <w:shd w:val="clear" w:color="auto" w:fill="F5F7FA"/>
             <w:tcBorders>
               <w:bottom w:val="single" w:sz="4" w:color="D0D5DD"/>
             </w:tcBorders>
@@ -1698,7 +1661,6 @@
         <w:tc>
           <w:tcPr>
             <w:tcW w:type="dxa" w:w="6746"/>
-            <w:shd w:val="clear" w:color="auto" w:fill="F5F7FA"/>
             <w:tcBorders>
               <w:bottom w:val="single" w:sz="4" w:color="D0D5DD"/>
             </w:tcBorders>
@@ -1726,6 +1688,7 @@
         <w:tc>
           <w:tcPr>
             <w:tcW w:type="dxa" w:w="3118"/>
+            <w:shd w:val="clear" w:color="auto" w:fill="F5F7FA"/>
             <w:tcBorders>
               <w:bottom w:val="single" w:sz="4" w:color="D0D5DD"/>
             </w:tcBorders>
@@ -1751,6 +1714,7 @@
         <w:tc>
           <w:tcPr>
             <w:tcW w:type="dxa" w:w="6746"/>
+            <w:shd w:val="clear" w:color="auto" w:fill="F5F7FA"/>
             <w:tcBorders>
               <w:bottom w:val="single" w:sz="4" w:color="D0D5DD"/>
             </w:tcBorders>
@@ -1778,7 +1742,6 @@
         <w:tc>
           <w:tcPr>
             <w:tcW w:type="dxa" w:w="3118"/>
-            <w:shd w:val="clear" w:color="auto" w:fill="F5F7FA"/>
             <w:tcBorders>
               <w:bottom w:val="single" w:sz="4" w:color="D0D5DD"/>
             </w:tcBorders>
@@ -1804,7 +1767,6 @@
         <w:tc>
           <w:tcPr>
             <w:tcW w:type="dxa" w:w="6746"/>
-            <w:shd w:val="clear" w:color="auto" w:fill="F5F7FA"/>
             <w:tcBorders>
               <w:bottom w:val="single" w:sz="4" w:color="D0D5DD"/>
             </w:tcBorders>
@@ -2316,6 +2278,22 @@
         </w:tc>
       </w:tr>
     </w:tbl>
+    <w:p>
+      <w:pPr>
+        <w:spacing w:before="240" w:after="80"/>
+      </w:pPr>
+      <w:r>
+        <w:rPr>
+          <w:rFonts w:ascii="Arial" w:hAnsi="Arial"/>
+          <w:rFonts w:ascii="Arial" w:hAnsi="Arial" w:cs="Arial"/>
+          <w:b/>
+          <w:i w:val="0"/>
+          <w:color w:val="0A2342"/>
+          <w:sz w:val="22"/>
+        </w:rPr>
+        <w:t>Lending position 1 of 1 — LN-L-2026-0218</w:t>
+      </w:r>
+    </w:p>
     <w:tbl>
       <w:tblPr>
         <w:tblW w:type="auto" w:w="0"/>
@@ -2348,7 +2326,7 @@
                 <w:color w:val="0A2342"/>
                 <w:sz w:val="18"/>
               </w:rPr>
-              <w:t>Loan ID</w:t>
+              <w:t>Asset custody</w:t>
             </w:r>
           </w:p>
         </w:tc>
@@ -2373,7 +2351,7 @@
                 <w:color w:val="4A5568"/>
                 <w:sz w:val="18"/>
               </w:rPr>
-              <w:t>LN-L-2026-0218</w:t>
+              <w:t>Asset transferred to Hex Trust; returned at maturity</w:t>
             </w:r>
           </w:p>
         </w:tc>
@@ -2401,7 +2379,7 @@
                 <w:color w:val="0A2342"/>
                 <w:sz w:val="18"/>
               </w:rPr>
-              <w:t>Asset custody</w:t>
+              <w:t>Rate type</w:t>
             </w:r>
           </w:p>
         </w:tc>
@@ -2409,58 +2387,6 @@
           <w:tcPr>
             <w:tcW w:type="dxa" w:w="6746"/>
             <w:shd w:val="clear" w:color="auto" w:fill="F5F7FA"/>
-            <w:tcBorders>
-              <w:bottom w:val="single" w:sz="4" w:color="D0D5DD"/>
-            </w:tcBorders>
-            <w:vAlign w:val="center"/>
-          </w:tcPr>
-          <w:p>
-            <w:pPr>
-              <w:spacing w:before="40" w:after="40"/>
-            </w:pPr>
-            <w:r>
-              <w:rPr>
-                <w:rFonts w:ascii="Arial" w:hAnsi="Arial"/>
-                <w:rFonts w:ascii="Arial" w:hAnsi="Arial" w:cs="Arial"/>
-                <w:b w:val="0"/>
-                <w:i w:val="0"/>
-                <w:color w:val="4A5568"/>
-                <w:sz w:val="18"/>
-              </w:rPr>
-              <w:t>Asset transferred to Hex Trust; returned at maturity</w:t>
-            </w:r>
-          </w:p>
-        </w:tc>
-      </w:tr>
-      <w:tr>
-        <w:tc>
-          <w:tcPr>
-            <w:tcW w:type="dxa" w:w="3118"/>
-            <w:tcBorders>
-              <w:bottom w:val="single" w:sz="4" w:color="D0D5DD"/>
-            </w:tcBorders>
-            <w:vAlign w:val="center"/>
-          </w:tcPr>
-          <w:p>
-            <w:pPr>
-              <w:spacing w:before="40" w:after="40"/>
-            </w:pPr>
-            <w:r>
-              <w:rPr>
-                <w:rFonts w:ascii="Arial" w:hAnsi="Arial"/>
-                <w:rFonts w:ascii="Arial" w:hAnsi="Arial" w:cs="Arial"/>
-                <w:b/>
-                <w:i w:val="0"/>
-                <w:color w:val="0A2342"/>
-                <w:sz w:val="18"/>
-              </w:rPr>
-              <w:t>Rate type</w:t>
-            </w:r>
-          </w:p>
-        </w:tc>
-        <w:tc>
-          <w:tcPr>
-            <w:tcW w:type="dxa" w:w="6746"/>
             <w:tcBorders>
               <w:bottom w:val="single" w:sz="4" w:color="D0D5DD"/>
             </w:tcBorders>
@@ -2488,7 +2414,6 @@
         <w:tc>
           <w:tcPr>
             <w:tcW w:type="dxa" w:w="3118"/>
-            <w:shd w:val="clear" w:color="auto" w:fill="F5F7FA"/>
             <w:tcBorders>
               <w:bottom w:val="single" w:sz="4" w:color="D0D5DD"/>
             </w:tcBorders>
@@ -2514,7 +2439,6 @@
         <w:tc>
           <w:tcPr>
             <w:tcW w:type="dxa" w:w="6746"/>
-            <w:shd w:val="clear" w:color="auto" w:fill="F5F7FA"/>
             <w:tcBorders>
               <w:bottom w:val="single" w:sz="4" w:color="D0D5DD"/>
             </w:tcBorders>
@@ -2542,6 +2466,7 @@
         <w:tc>
           <w:tcPr>
             <w:tcW w:type="dxa" w:w="3118"/>
+            <w:shd w:val="clear" w:color="auto" w:fill="F5F7FA"/>
             <w:tcBorders>
               <w:bottom w:val="single" w:sz="4" w:color="D0D5DD"/>
             </w:tcBorders>
@@ -2567,6 +2492,7 @@
         <w:tc>
           <w:tcPr>
             <w:tcW w:type="dxa" w:w="6746"/>
+            <w:shd w:val="clear" w:color="auto" w:fill="F5F7FA"/>
             <w:tcBorders>
               <w:bottom w:val="single" w:sz="4" w:color="D0D5DD"/>
             </w:tcBorders>
@@ -2594,7 +2520,6 @@
         <w:tc>
           <w:tcPr>
             <w:tcW w:type="dxa" w:w="3118"/>
-            <w:shd w:val="clear" w:color="auto" w:fill="F5F7FA"/>
             <w:tcBorders>
               <w:bottom w:val="single" w:sz="4" w:color="D0D5DD"/>
             </w:tcBorders>
@@ -2620,7 +2545,6 @@
         <w:tc>
           <w:tcPr>
             <w:tcW w:type="dxa" w:w="6746"/>
-            <w:shd w:val="clear" w:color="auto" w:fill="F5F7FA"/>
             <w:tcBorders>
               <w:bottom w:val="single" w:sz="4" w:color="D0D5DD"/>
             </w:tcBorders>

</xml_diff>